<commit_message>
Bylaws: single tiebreaker order (record, PF, H2H, coin flip; no PA) in Tie Breakers + seeding; changelog; regen docx/pdf; office.js v5
</commit_message>
<xml_diff>
--- a/office/docs/bylaws-2026.docx
+++ b/office/docs/bylaws-2026.docx
@@ -1855,7 +1855,7 @@
           <w:b/>
           <w:color w:val="1A2A4A"/>
         </w:rPr>
-        <w:t>Unless otherwise specified, rankings and tie breakers are handled according to this order:</w:t>
+        <w:t>All standings, playoff seeding and Toilet Bowl seeding ties are broken in this order:</w:t>
       </w:r>
     </w:p>
     <w:p>
@@ -1863,7 +1863,7 @@
         <w:pStyle w:val="ListBullet"/>
       </w:pPr>
       <w:r>
-        <w:t>Winning percentage</w:t>
+        <w:t>1) Record (winning percentage)</w:t>
       </w:r>
     </w:p>
     <w:p>
@@ -1871,7 +1871,7 @@
         <w:pStyle w:val="ListBullet"/>
       </w:pPr>
       <w:r>
-        <w:t>Total points scored</w:t>
+        <w:t>2) Total points for</w:t>
       </w:r>
     </w:p>
     <w:p>
@@ -1879,7 +1879,7 @@
         <w:pStyle w:val="ListBullet"/>
       </w:pPr>
       <w:r>
-        <w:t>Head-to-head matchup results</w:t>
+        <w:t>3) Head-to-head record</w:t>
       </w:r>
     </w:p>
     <w:p>
@@ -1887,7 +1887,7 @@
         <w:pStyle w:val="ListBullet"/>
       </w:pPr>
       <w:r>
-        <w:t>Coin flip</w:t>
+        <w:t>4) Coin flip</w:t>
       </w:r>
     </w:p>
     <w:p>
@@ -1920,7 +1920,7 @@
         <w:pStyle w:val="ListBullet"/>
       </w:pPr>
       <w:r>
-        <w:t>To rank teams and determine seeding the following will be considered: Overall Record &gt; Total Points For &gt; Total Points against &gt; Head to Head Record.</w:t>
+        <w:t>To rank teams and determine seeding the following will be considered: Record (winning percentage) &gt; Total Points For &gt; Head-to-Head Record &gt; Coin Flip (see Tie Breakers).</w:t>
       </w:r>
     </w:p>
     <w:p>
@@ -1928,7 +1928,7 @@
         <w:pStyle w:val="ListBullet2"/>
       </w:pPr>
       <w:r>
-        <w:t>The top 6 regular season records will be in the playoffs. Ties will be broken by who has the most total points scored in a regular season. If there is still a tie then it will be broken by who has the most total points scored against them. If there is still a tie then it will be broken by the head to head record of teams.</w:t>
+        <w:t>The top 6 regular season records will be in the playoffs. Ties will be broken by most total regular season points for, then head-to-head record, then a coin flip. Points against is not used.</w:t>
       </w:r>
     </w:p>
     <w:p>
@@ -3527,6 +3527,62 @@
       </w:pPr>
       <w:r>
         <w:t>Rule Changes: The referenced "section 27" did not exist; Changelog section added.</w:t>
+      </w:r>
+    </w:p>
+    <w:p>
+      <w:pPr>
+        <w:pStyle w:val="ListBullet"/>
+      </w:pPr>
+      <w:r>
+        <w:t>Tie Breakers: League-approved single tiebreaker order (Oct 2026): record, points for, head-to-head, coin flip; points against dropped.</w:t>
+      </w:r>
+    </w:p>
+    <w:p>
+      <w:pPr>
+        <w:pStyle w:val="ListBullet"/>
+      </w:pPr>
+      <w:r>
+        <w:t>Tie Breakers: League-approved single tiebreaker order (Oct 2026): record, points for, head-to-head, coin flip; points against dropped.</w:t>
+      </w:r>
+    </w:p>
+    <w:p>
+      <w:pPr>
+        <w:pStyle w:val="ListBullet"/>
+      </w:pPr>
+      <w:r>
+        <w:t>Tie Breakers: League-approved single tiebreaker order (Oct 2026): record, points for, head-to-head, coin flip; points against dropped.</w:t>
+      </w:r>
+    </w:p>
+    <w:p>
+      <w:pPr>
+        <w:pStyle w:val="ListBullet"/>
+      </w:pPr>
+      <w:r>
+        <w:t>Tie Breakers: League-approved single tiebreaker order (Oct 2026): record, points for, head-to-head, coin flip; points against dropped.</w:t>
+      </w:r>
+    </w:p>
+    <w:p>
+      <w:pPr>
+        <w:pStyle w:val="ListBullet"/>
+      </w:pPr>
+      <w:r>
+        <w:t>Tie Breakers: League-approved single tiebreaker order (Oct 2026): record, points for, head-to-head, coin flip; points against dropped.</w:t>
+      </w:r>
+    </w:p>
+    <w:p>
+      <w:pPr>
+        <w:pStyle w:val="ListBullet"/>
+      </w:pPr>
+      <w:r>
+        <w:t>Regular Season, Playoffs, and Toilet Bowl: League-approved single tiebreaker order (Oct 2026): record, points for, head-to-head, coin flip; points against dropped.</w:t>
+      </w:r>
+    </w:p>
+    <w:p>
+      <w:pPr>
+        <w:pStyle w:val="ListBullet"/>
+      </w:pPr>
+      <w:r>
+        <w:t>Regular Season, Playoffs, and Toilet Bowl: League-approved single tiebreaker order (Oct 2026): record, points for, head-to-head, coin flip; points against dropped.</w:t>
       </w:r>
     </w:p>
     <w:sectPr>

</xml_diff>

<commit_message>
Bylaws: tiebreakers = Sleeper default (record, PF, higher PA, coin flip; no H2H; custom seeding override) in Tie Breakers + seeding; changelog; regen docx/pdf; office.js v5
</commit_message>
<xml_diff>
--- a/office/docs/bylaws-2026.docx
+++ b/office/docs/bylaws-2026.docx
@@ -1855,7 +1855,7 @@
           <w:b/>
           <w:color w:val="1A2A4A"/>
         </w:rPr>
-        <w:t>All standings, playoff seeding and Toilet Bowl seeding ties are broken in this order:</w:t>
+        <w:t>All standings, playoff seeding and Toilet Bowl seeding ties are broken in this order (Sleeper default):</w:t>
       </w:r>
     </w:p>
     <w:p>
@@ -1863,7 +1863,7 @@
         <w:pStyle w:val="ListBullet"/>
       </w:pPr>
       <w:r>
-        <w:t>1) Record (winning percentage)</w:t>
+        <w:t>1) Overall record</w:t>
       </w:r>
     </w:p>
     <w:p>
@@ -1871,7 +1871,7 @@
         <w:pStyle w:val="ListBullet"/>
       </w:pPr>
       <w:r>
-        <w:t>2) Total points for</w:t>
+        <w:t>2) Points for</w:t>
       </w:r>
     </w:p>
     <w:p>
@@ -1879,7 +1879,7 @@
         <w:pStyle w:val="ListBullet"/>
       </w:pPr>
       <w:r>
-        <w:t>3) Head-to-head record</w:t>
+        <w:t>3) Higher points against</w:t>
       </w:r>
     </w:p>
     <w:p>
@@ -1891,6 +1891,11 @@
       </w:r>
     </w:p>
     <w:p>
+      <w:r>
+        <w:t>Commissioners may override seeding through Sleeper custom seeding.</w:t>
+      </w:r>
+    </w:p>
+    <w:p>
       <w:bookmarkStart w:id="9" w:name="s_regular_season_playoffs_and_toilet_bowl"/>
       <w:pPr>
         <w:pStyle w:val="Heading1"/>
@@ -1920,7 +1925,7 @@
         <w:pStyle w:val="ListBullet"/>
       </w:pPr>
       <w:r>
-        <w:t>To rank teams and determine seeding the following will be considered: Record (winning percentage) &gt; Total Points For &gt; Head-to-Head Record &gt; Coin Flip (see Tie Breakers).</w:t>
+        <w:t>To rank teams and determine seeding the following will be considered: Overall Record &gt; Points For &gt; Higher Points Against &gt; Coin Flip (see Tie Breakers).</w:t>
       </w:r>
     </w:p>
     <w:p>
@@ -1928,7 +1933,7 @@
         <w:pStyle w:val="ListBullet2"/>
       </w:pPr>
       <w:r>
-        <w:t>The top 6 regular season records will be in the playoffs. Ties will be broken by most total regular season points for, then head-to-head record, then a coin flip. Points against is not used.</w:t>
+        <w:t>The top 6 regular season records will be in the playoffs. Ties will be broken by most regular season points for, then higher points against, then a coin flip. Head-to-head is not used. Commissioners may override via Sleeper custom seeding.</w:t>
       </w:r>
     </w:p>
     <w:p>
@@ -3534,7 +3539,7 @@
         <w:pStyle w:val="ListBullet"/>
       </w:pPr>
       <w:r>
-        <w:t>Tie Breakers: League-approved single tiebreaker order (Oct 2026): record, points for, head-to-head, coin flip; points against dropped.</w:t>
+        <w:t>Tie Breakers: Single tiebreaker order = Sleeper's default for leagues without divisions: overall record, points for, higher points against, coin flip (no head-to-head). Source: support.sleeper.com article 2203518.</w:t>
       </w:r>
     </w:p>
     <w:p>
@@ -3542,47 +3547,7 @@
         <w:pStyle w:val="ListBullet"/>
       </w:pPr>
       <w:r>
-        <w:t>Tie Breakers: League-approved single tiebreaker order (Oct 2026): record, points for, head-to-head, coin flip; points against dropped.</w:t>
-      </w:r>
-    </w:p>
-    <w:p>
-      <w:pPr>
-        <w:pStyle w:val="ListBullet"/>
-      </w:pPr>
-      <w:r>
-        <w:t>Tie Breakers: League-approved single tiebreaker order (Oct 2026): record, points for, head-to-head, coin flip; points against dropped.</w:t>
-      </w:r>
-    </w:p>
-    <w:p>
-      <w:pPr>
-        <w:pStyle w:val="ListBullet"/>
-      </w:pPr>
-      <w:r>
-        <w:t>Tie Breakers: League-approved single tiebreaker order (Oct 2026): record, points for, head-to-head, coin flip; points against dropped.</w:t>
-      </w:r>
-    </w:p>
-    <w:p>
-      <w:pPr>
-        <w:pStyle w:val="ListBullet"/>
-      </w:pPr>
-      <w:r>
-        <w:t>Tie Breakers: League-approved single tiebreaker order (Oct 2026): record, points for, head-to-head, coin flip; points against dropped.</w:t>
-      </w:r>
-    </w:p>
-    <w:p>
-      <w:pPr>
-        <w:pStyle w:val="ListBullet"/>
-      </w:pPr>
-      <w:r>
-        <w:t>Regular Season, Playoffs, and Toilet Bowl: League-approved single tiebreaker order (Oct 2026): record, points for, head-to-head, coin flip; points against dropped.</w:t>
-      </w:r>
-    </w:p>
-    <w:p>
-      <w:pPr>
-        <w:pStyle w:val="ListBullet"/>
-      </w:pPr>
-      <w:r>
-        <w:t>Regular Season, Playoffs, and Toilet Bowl: League-approved single tiebreaker order (Oct 2026): record, points for, head-to-head, coin flip; points against dropped.</w:t>
+        <w:t>Regular Season, Playoffs, and Toilet Bowl: Single tiebreaker order = Sleeper's default for leagues without divisions: overall record, points for, higher points against, coin flip (no head-to-head). Source: support.sleeper.com article 2203518.</w:t>
       </w:r>
     </w:p>
     <w:sectPr>

</xml_diff>

<commit_message>
Bylaws: strip § heading prefix (site/docx/pdf) and Symbol-font PUA bullets (U+F0B7) from docx/pdf; sanitize zero-width/NBSP/PUA/control chars in source; office.js v6
</commit_message>
<xml_diff>
--- a/office/docs/bylaws-2026.docx
+++ b/office/docs/bylaws-2026.docx
@@ -749,7 +749,7 @@
         <w:pStyle w:val="Heading1"/>
       </w:pPr>
       <w:r>
-        <w:t>§1  League Summary</w:t>
+        <w:t>1. League Summary</w:t>
       </w:r>
       <w:bookmarkEnd w:id="2"/>
     </w:p>
@@ -935,7 +935,7 @@
         <w:pStyle w:val="Heading1"/>
       </w:pPr>
       <w:r>
-        <w:t>§2  General League Calendar</w:t>
+        <w:t>2. General League Calendar</w:t>
       </w:r>
       <w:bookmarkEnd w:id="3"/>
     </w:p>
@@ -1500,7 +1500,7 @@
         <w:pStyle w:val="Heading1"/>
       </w:pPr>
       <w:r>
-        <w:t>§3  League Platforms</w:t>
+        <w:t>3. League Platforms</w:t>
       </w:r>
       <w:bookmarkEnd w:id="4"/>
     </w:p>
@@ -1525,7 +1525,7 @@
         <w:pStyle w:val="Heading1"/>
       </w:pPr>
       <w:r>
-        <w:t>§4  Scoring</w:t>
+        <w:t>4. Scoring</w:t>
       </w:r>
       <w:bookmarkEnd w:id="5"/>
     </w:p>
@@ -1717,7 +1717,7 @@
         <w:pStyle w:val="Heading1"/>
       </w:pPr>
       <w:r>
-        <w:t>§5  Rosters</w:t>
+        <w:t>5. Rosters</w:t>
       </w:r>
       <w:bookmarkEnd w:id="6"/>
     </w:p>
@@ -1804,7 +1804,7 @@
         <w:pStyle w:val="Heading1"/>
       </w:pPr>
       <w:r>
-        <w:t>§6  Lineups</w:t>
+        <w:t>6. Lineups</w:t>
       </w:r>
       <w:bookmarkEnd w:id="7"/>
     </w:p>
@@ -1845,7 +1845,7 @@
         <w:pStyle w:val="Heading1"/>
       </w:pPr>
       <w:r>
-        <w:t>§7  Tie Breakers</w:t>
+        <w:t>7. Tie Breakers</w:t>
       </w:r>
       <w:bookmarkEnd w:id="8"/>
     </w:p>
@@ -1901,7 +1901,7 @@
         <w:pStyle w:val="Heading1"/>
       </w:pPr>
       <w:r>
-        <w:t>§8  Regular Season, Playoffs, and Toilet Bowl</w:t>
+        <w:t>8. Regular Season, Playoffs, and Toilet Bowl</w:t>
       </w:r>
       <w:bookmarkEnd w:id="9"/>
     </w:p>
@@ -2075,7 +2075,7 @@
         <w:pStyle w:val="Heading1"/>
       </w:pPr>
       <w:r>
-        <w:t>§9  Fees &amp; Payouts</w:t>
+        <w:t>9. Fees &amp; Payouts</w:t>
       </w:r>
       <w:bookmarkEnd w:id="10"/>
     </w:p>
@@ -2199,7 +2199,7 @@
         <w:pStyle w:val="Heading1"/>
       </w:pPr>
       <w:r>
-        <w:t>§10  Trading</w:t>
+        <w:t>10. Trading</w:t>
       </w:r>
       <w:bookmarkEnd w:id="11"/>
     </w:p>
@@ -2234,7 +2234,7 @@
         <w:pStyle w:val="Heading1"/>
       </w:pPr>
       <w:r>
-        <w:t>§11  Free Agent Acquisition/Waivers</w:t>
+        <w:t>11. Free Agent Acquisition/Waivers</w:t>
       </w:r>
       <w:bookmarkEnd w:id="12"/>
     </w:p>
@@ -2286,7 +2286,7 @@
         <w:pStyle w:val="Heading1"/>
       </w:pPr>
       <w:r>
-        <w:t>§12  Tanking</w:t>
+        <w:t>12. Tanking</w:t>
       </w:r>
       <w:bookmarkEnd w:id="13"/>
     </w:p>
@@ -2309,7 +2309,7 @@
         <w:pStyle w:val="Heading1"/>
       </w:pPr>
       <w:r>
-        <w:t>§13  Annual Rookie/FA Draft</w:t>
+        <w:t>13. Annual Rookie/FA Draft</w:t>
       </w:r>
       <w:bookmarkEnd w:id="14"/>
     </w:p>
@@ -2354,7 +2354,7 @@
         <w:pStyle w:val="Heading1"/>
       </w:pPr>
       <w:r>
-        <w:t>§14  Startup Draft</w:t>
+        <w:t>14. Startup Draft</w:t>
       </w:r>
       <w:bookmarkEnd w:id="15"/>
     </w:p>
@@ -2399,7 +2399,7 @@
         <w:pStyle w:val="Heading1"/>
       </w:pPr>
       <w:r>
-        <w:t>§15  Unintentional Roster Moves</w:t>
+        <w:t>15. Unintentional Roster Moves</w:t>
       </w:r>
       <w:bookmarkEnd w:id="16"/>
     </w:p>
@@ -2432,7 +2432,7 @@
         <w:pStyle w:val="Heading1"/>
       </w:pPr>
       <w:r>
-        <w:t>§16  Computer Failure</w:t>
+        <w:t>16. Computer Failure</w:t>
       </w:r>
       <w:bookmarkEnd w:id="17"/>
     </w:p>
@@ -2455,7 +2455,7 @@
         <w:pStyle w:val="Heading1"/>
       </w:pPr>
       <w:r>
-        <w:t>§17  Teams, Ownership, and Replacement</w:t>
+        <w:t>17. Teams, Ownership, and Replacement</w:t>
       </w:r>
       <w:bookmarkEnd w:id="18"/>
     </w:p>
@@ -2540,7 +2540,7 @@
         <w:pStyle w:val="Heading1"/>
       </w:pPr>
       <w:r>
-        <w:t>§18  Team Abandonment</w:t>
+        <w:t>18. Team Abandonment</w:t>
       </w:r>
       <w:bookmarkEnd w:id="19"/>
     </w:p>
@@ -2601,7 +2601,7 @@
         <w:pStyle w:val="Heading1"/>
       </w:pPr>
       <w:r>
-        <w:t>§19  Refunds</w:t>
+        <w:t>19. Refunds</w:t>
       </w:r>
       <w:bookmarkEnd w:id="20"/>
     </w:p>
@@ -2665,7 +2665,7 @@
         <w:pStyle w:val="Heading1"/>
       </w:pPr>
       <w:r>
-        <w:t>§20  Anti-competitive Behavior</w:t>
+        <w:t>20. Anti-competitive Behavior</w:t>
       </w:r>
       <w:bookmarkEnd w:id="21"/>
     </w:p>
@@ -2750,7 +2750,7 @@
         <w:pStyle w:val="Heading1"/>
       </w:pPr>
       <w:r>
-        <w:t>§21  Activity Rules</w:t>
+        <w:t>21. Activity Rules</w:t>
       </w:r>
       <w:bookmarkEnd w:id="22"/>
     </w:p>
@@ -2819,7 +2819,7 @@
         <w:pStyle w:val="Heading1"/>
       </w:pPr>
       <w:r>
-        <w:t>§22  Owner Conduct &amp; Responsibilities</w:t>
+        <w:t>22. Owner Conduct &amp; Responsibilities</w:t>
       </w:r>
       <w:bookmarkEnd w:id="23"/>
     </w:p>
@@ -2927,7 +2927,7 @@
         <w:pStyle w:val="Heading1"/>
       </w:pPr>
       <w:r>
-        <w:t>§23  Commissioner Responsibilities</w:t>
+        <w:t>23. Commissioner Responsibilities</w:t>
       </w:r>
       <w:bookmarkEnd w:id="24"/>
     </w:p>
@@ -3150,7 +3150,7 @@
         <w:pStyle w:val="Heading1"/>
       </w:pPr>
       <w:r>
-        <w:t>§24  League Disbanding</w:t>
+        <w:t>24. League Disbanding</w:t>
       </w:r>
       <w:bookmarkEnd w:id="25"/>
     </w:p>
@@ -3170,7 +3170,7 @@
         <w:pStyle w:val="Heading1"/>
       </w:pPr>
       <w:r>
-        <w:t>§25  Final Rule</w:t>
+        <w:t>25. Final Rule</w:t>
       </w:r>
       <w:bookmarkEnd w:id="26"/>
     </w:p>
@@ -3198,7 +3198,7 @@
         <w:pStyle w:val="Heading1"/>
       </w:pPr>
       <w:r>
-        <w:t>§26  Rule Changes</w:t>
+        <w:t>26. Rule Changes</w:t>
       </w:r>
       <w:bookmarkEnd w:id="27"/>
     </w:p>
@@ -3266,7 +3266,7 @@
         <w:pStyle w:val="Heading1"/>
       </w:pPr>
       <w:r>
-        <w:t>§27  Appendix</w:t>
+        <w:t>27. Appendix</w:t>
       </w:r>
       <w:bookmarkEnd w:id="28"/>
     </w:p>
@@ -3321,7 +3321,7 @@
         <w:pStyle w:val="Heading1"/>
       </w:pPr>
       <w:r>
-        <w:t>§28  Changelog</w:t>
+        <w:t>28. Changelog</w:t>
       </w:r>
       <w:bookmarkEnd w:id="29"/>
     </w:p>
@@ -3676,7 +3676,7 @@
     <w:lvl w:ilvl="0">
       <w:start w:val="1"/>
       <w:numFmt w:val="bullet"/>
-      <w:lvlText w:val=""/>
+      <w:lvlText w:val="•"/>
       <w:lvlJc w:val="left"/>
       <w:pPr>
         <w:tabs>
@@ -3685,7 +3685,7 @@
         <w:ind w:left="1440" w:hanging="360"/>
       </w:pPr>
       <w:rPr>
-        <w:rFonts w:ascii="Symbol" w:hAnsi="Symbol" w:hint="default"/>
+        <w:rFonts w:ascii="Georgia" w:hAnsi="Georgia" w:hint="Georgia"/>
       </w:rPr>
     </w:lvl>
   </w:abstractNum>
@@ -3697,7 +3697,7 @@
       <w:start w:val="1"/>
       <w:numFmt w:val="bullet"/>
       <w:pStyle w:val="ListBullet3"/>
-      <w:lvlText w:val=""/>
+      <w:lvlText w:val="•"/>
       <w:lvlJc w:val="left"/>
       <w:pPr>
         <w:tabs>
@@ -3706,7 +3706,7 @@
         <w:ind w:left="1080" w:hanging="360"/>
       </w:pPr>
       <w:rPr>
-        <w:rFonts w:ascii="Symbol" w:hAnsi="Symbol" w:hint="default"/>
+        <w:rFonts w:ascii="Georgia" w:hAnsi="Georgia" w:hint="Georgia"/>
       </w:rPr>
     </w:lvl>
   </w:abstractNum>
@@ -3718,7 +3718,7 @@
       <w:start w:val="1"/>
       <w:numFmt w:val="bullet"/>
       <w:pStyle w:val="ListBullet2"/>
-      <w:lvlText w:val=""/>
+      <w:lvlText w:val="•"/>
       <w:lvlJc w:val="left"/>
       <w:pPr>
         <w:tabs>
@@ -3727,7 +3727,7 @@
         <w:ind w:left="720" w:hanging="360"/>
       </w:pPr>
       <w:rPr>
-        <w:rFonts w:ascii="Symbol" w:hAnsi="Symbol" w:hint="default"/>
+        <w:rFonts w:ascii="Georgia" w:hAnsi="Georgia" w:hint="Georgia"/>
       </w:rPr>
     </w:lvl>
   </w:abstractNum>
@@ -3757,7 +3757,7 @@
       <w:start w:val="1"/>
       <w:numFmt w:val="bullet"/>
       <w:pStyle w:val="ListBullet"/>
-      <w:lvlText w:val=""/>
+      <w:lvlText w:val="•"/>
       <w:lvlJc w:val="left"/>
       <w:pPr>
         <w:tabs>
@@ -3766,7 +3766,7 @@
         <w:ind w:left="360" w:hanging="360"/>
       </w:pPr>
       <w:rPr>
-        <w:rFonts w:ascii="Symbol" w:hAnsi="Symbol" w:hint="default"/>
+        <w:rFonts w:ascii="Georgia" w:hAnsi="Georgia" w:hint="Georgia"/>
       </w:rPr>
     </w:lvl>
   </w:abstractNum>

</xml_diff>

<commit_message>
Bylaws: drop LeagueSafe; dues by Venmo to either co-commissioner; changelog; regen docx/pdf; office.js v7
</commit_message>
<xml_diff>
--- a/office/docs/bylaws-2026.docx
+++ b/office/docs/bylaws-2026.docx
@@ -827,14 +827,6 @@
     </w:p>
     <w:p>
       <w:pPr>
-        <w:pStyle w:val="ListBullet3"/>
-      </w:pPr>
-      <w:r>
-        <w:t>Less any applicable fees from LeagueSafe</w:t>
-      </w:r>
-    </w:p>
-    <w:p>
-      <w:pPr>
         <w:pStyle w:val="ListBullet"/>
       </w:pPr>
       <w:r>
@@ -894,7 +886,7 @@
         <w:pStyle w:val="ListBullet"/>
       </w:pPr>
       <w:r>
-        <w:t>League Annual Fee: $100 (less any applicable LeagueSafe fees)</w:t>
+        <w:t>League Annual Fee: $100</w:t>
       </w:r>
     </w:p>
     <w:p>
@@ -902,15 +894,7 @@
         <w:pStyle w:val="ListBullet2"/>
       </w:pPr>
       <w:r>
-        <w:t>Teams must pay prior to start of regular season via LeagueSafe</w:t>
-      </w:r>
-    </w:p>
-    <w:p>
-      <w:pPr>
-        <w:pStyle w:val="ListBullet3"/>
-      </w:pPr>
-      <w:r>
-        <w:t>Annual Fee: $100 (less any applicable LeagueSafe fees)</w:t>
+        <w:t>Pay before the regular season starts: Venmo either co-commissioner (Brett or Joe)</w:t>
       </w:r>
     </w:p>
     <w:p>
@@ -1392,7 +1376,7 @@
                 <w:b w:val="0"/>
                 <w:sz w:val="19"/>
               </w:rPr>
-              <w:t>LeagueSafe Payouts [or earlier]</w:t>
+              <w:t>Prize payouts via Venmo [or earlier]</w:t>
             </w:r>
           </w:p>
         </w:tc>
@@ -1516,7 +1500,7 @@
     </w:p>
     <w:p>
       <w:r>
-        <w:t>League fees will be paid through LeagueSafe.</w:t>
+        <w:t>League dues are paid by Venmo to either co-commissioner (Brett or Joe), who take turns managing the money.</w:t>
       </w:r>
     </w:p>
     <w:p>
@@ -2093,7 +2077,7 @@
         <w:pStyle w:val="ListBullet"/>
       </w:pPr>
       <w:r>
-        <w:t>League dues are $100/team/year paid to LeagueSafe, due on or before the startup draft and by League Reset Day of the successive years. Any LeagueSafe fees shall be paid by the respective owner and generally consists of 3%.</w:t>
+        <w:t>League dues are $100/team/year, paid by Venmo to either co-commissioner (Brett or Joe), who take turns managing the money. Pay by League Reset Day each year.</w:t>
       </w:r>
     </w:p>
     <w:p>
@@ -2627,7 +2611,7 @@
         <w:pStyle w:val="ListBullet2"/>
       </w:pPr>
       <w:r>
-        <w:t>Example: Leaving Owner finds Replacement Owner. Replacement owner pays $60 to LeagueSafe (partial current year, full prepaid year). Leaving owner receives a refund of up to $60.</w:t>
+        <w:t>Example: Leaving Owner finds Replacement Owner. Replacement owner Venmos $60 to the co-commissioner holding the money (partial current year, full prepaid year). Leaving owner receives a refund of up to $60.</w:t>
       </w:r>
     </w:p>
     <w:p>
@@ -3161,7 +3145,7 @@
     </w:p>
     <w:p>
       <w:r>
-        <w:t>The league may vote to fold or restart with a 10/12 vote except where otherwise stated. If the league folds, all monies held in LeagueSafe shall be distributed equally to all members at time of folding</w:t>
+        <w:t>The league may vote to fold or restart with a 10/12 vote except where otherwise stated. If the league folds, whatever money the co-commissioners are holding gets split equally to all members at time of folding</w:t>
       </w:r>
     </w:p>
     <w:p>
@@ -3371,7 +3355,7 @@
         <w:pStyle w:val="ListBullet"/>
       </w:pPr>
       <w:r>
-        <w:t>League Summary: Duplicate line merged into a clarification.</w:t>
+        <w:t>General League Calendar: Matches Sleeper: playoff_week_start 15, trade_deadline 14, daily_waivers off, waiver_clear_days 2, taxi_deadline 4, draft_rounds 4.</w:t>
       </w:r>
     </w:p>
     <w:p>
@@ -3379,7 +3363,7 @@
         <w:pStyle w:val="ListBullet"/>
       </w:pPr>
       <w:r>
-        <w:t>General League Calendar: Matches Sleeper: playoff_week_start 15, trade_deadline 14, daily_waivers off, waiver_clear_days 2, taxi_deadline 4, draft_rounds 4.</w:t>
+        <w:t>Scoring: Grammar; clarifies it is a QB interception.</w:t>
       </w:r>
     </w:p>
     <w:p>
@@ -3387,7 +3371,7 @@
         <w:pStyle w:val="ListBullet"/>
       </w:pPr>
       <w:r>
-        <w:t>Scoring: Grammar; clarifies it is a QB interception.</w:t>
+        <w:t>Scoring: Grammar.</w:t>
       </w:r>
     </w:p>
     <w:p>
@@ -3395,7 +3379,7 @@
         <w:pStyle w:val="ListBullet"/>
       </w:pPr>
       <w:r>
-        <w:t>Scoring: Grammar.</w:t>
+        <w:t>Scoring: Bylaws listed a DST starter but no DST scoring; documented exactly as configured in Sleeper (no rule change).</w:t>
       </w:r>
     </w:p>
     <w:p>
@@ -3403,7 +3387,7 @@
         <w:pStyle w:val="ListBullet"/>
       </w:pPr>
       <w:r>
-        <w:t>Scoring: Bylaws listed a DST starter but no DST scoring; documented exactly as configured in Sleeper (no rule change).</w:t>
+        <w:t>Rosters: Sleeper reserve settings: Out/Suspended/DNR/COVID allowed; Doubtful and NA not allowed.</w:t>
       </w:r>
     </w:p>
     <w:p>
@@ -3411,7 +3395,7 @@
         <w:pStyle w:val="ListBullet"/>
       </w:pPr>
       <w:r>
-        <w:t>Rosters: Sleeper reserve settings: Out/Suspended/DNR/COVID allowed; Doubtful and NA not allowed.</w:t>
+        <w:t>Rosters: Bylaws had no taxi rules; Sleeper: 4 slots, rookies only (taxi_years 1, vets not allowed), deadline Week 4. 2027 two-year eligibility was approved by the league (Sleeper to be changed to 2 years for 2027).</w:t>
       </w:r>
     </w:p>
     <w:p>
@@ -3419,7 +3403,7 @@
         <w:pStyle w:val="ListBullet"/>
       </w:pPr>
       <w:r>
-        <w:t>Rosters: Bylaws had no taxi rules; Sleeper: 4 slots, rookies only (taxi_years 1, vets not allowed), deadline Week 4. 2027 two-year eligibility was approved by the league (Sleeper to be changed to 2 years for 2027).</w:t>
+        <w:t>Regular Season, Playoffs, and Toilet Bowl: Sleeper playoff_week_start = 15; also fixes the contradiction with the 14-week League Summary.</w:t>
       </w:r>
     </w:p>
     <w:p>
@@ -3427,7 +3411,7 @@
         <w:pStyle w:val="ListBullet"/>
       </w:pPr>
       <w:r>
-        <w:t>Regular Season, Playoffs, and Toilet Bowl: Sleeper playoff_week_start = 15; also fixes the contradiction with the 14-week League Summary.</w:t>
+        <w:t>Regular Season, Playoffs, and Toilet Bowl: Sleeper playoff weeks 15-17.</w:t>
       </w:r>
     </w:p>
     <w:p>
@@ -3435,7 +3419,7 @@
         <w:pStyle w:val="ListBullet"/>
       </w:pPr>
       <w:r>
-        <w:t>Regular Season, Playoffs, and Toilet Bowl: Sleeper playoff weeks 15-17.</w:t>
+        <w:t>Regular Season, Playoffs, and Toilet Bowl: Round 1 is Week 15.</w:t>
       </w:r>
     </w:p>
     <w:p>
@@ -3443,7 +3427,7 @@
         <w:pStyle w:val="ListBullet"/>
       </w:pPr>
       <w:r>
-        <w:t>Regular Season, Playoffs, and Toilet Bowl: Round 1 is Week 15.</w:t>
+        <w:t>Regular Season, Playoffs, and Toilet Bowl: Round 2 is Week 16.</w:t>
       </w:r>
     </w:p>
     <w:p>
@@ -3451,7 +3435,7 @@
         <w:pStyle w:val="ListBullet"/>
       </w:pPr>
       <w:r>
-        <w:t>Regular Season, Playoffs, and Toilet Bowl: Round 2 is Week 16.</w:t>
+        <w:t>Regular Season, Playoffs, and Toilet Bowl: Championship is Week 17.</w:t>
       </w:r>
     </w:p>
     <w:p>
@@ -3459,7 +3443,7 @@
         <w:pStyle w:val="ListBullet"/>
       </w:pPr>
       <w:r>
-        <w:t>Regular Season, Playoffs, and Toilet Bowl: Championship is Week 17.</w:t>
+        <w:t>Regular Season, Playoffs, and Toilet Bowl: Dangling section reference "7.3.1" (document has no numbered sections).</w:t>
       </w:r>
     </w:p>
     <w:p>
@@ -3467,7 +3451,7 @@
         <w:pStyle w:val="ListBullet"/>
       </w:pPr>
       <w:r>
-        <w:t>Regular Season, Playoffs, and Toilet Bowl: Dangling section reference "7.3.1" (document has no numbered sections).</w:t>
+        <w:t>Trading: Sleeper trade_deadline = 14.</w:t>
       </w:r>
     </w:p>
     <w:p>
@@ -3475,7 +3459,7 @@
         <w:pStyle w:val="ListBullet"/>
       </w:pPr>
       <w:r>
-        <w:t>Trading: Sleeper trade_deadline = 14.</w:t>
+        <w:t>Free Agent Acquisition/Waivers: Sleeper: FAAB $100, weekly waiver day (Tuesday night), waiver_clear_days 2, daily waivers off.</w:t>
       </w:r>
     </w:p>
     <w:p>
@@ -3483,7 +3467,7 @@
         <w:pStyle w:val="ListBullet"/>
       </w:pPr>
       <w:r>
-        <w:t>Free Agent Acquisition/Waivers: Sleeper: FAAB $100, weekly waiver day (Tuesday night), waiver_clear_days 2, daily waivers off.</w:t>
+        <w:t>Free Agent Acquisition/Waivers: Name made consistent with the League Summary.</w:t>
       </w:r>
     </w:p>
     <w:p>
@@ -3491,7 +3475,7 @@
         <w:pStyle w:val="ListBullet"/>
       </w:pPr>
       <w:r>
-        <w:t>Free Agent Acquisition/Waivers: Name made consistent with the League Summary.</w:t>
+        <w:t>Annual Rookie/FA Draft: Sleeper draft_rounds = 4 (not previously stated).</w:t>
       </w:r>
     </w:p>
     <w:p>
@@ -3499,7 +3483,7 @@
         <w:pStyle w:val="ListBullet"/>
       </w:pPr>
       <w:r>
-        <w:t>Annual Rookie/FA Draft: Sleeper draft_rounds = 4 (not previously stated).</w:t>
+        <w:t>Teams, Ownership, and Replacement: Grammar.</w:t>
       </w:r>
     </w:p>
     <w:p>
@@ -3507,7 +3491,7 @@
         <w:pStyle w:val="ListBullet"/>
       </w:pPr>
       <w:r>
-        <w:t>Teams, Ownership, and Replacement: Grammar.</w:t>
+        <w:t>Refunds: Garbled phrase.</w:t>
       </w:r>
     </w:p>
     <w:p>
@@ -3515,7 +3499,7 @@
         <w:pStyle w:val="ListBullet"/>
       </w:pPr>
       <w:r>
-        <w:t>Refunds: Garbled phrase.</w:t>
+        <w:t>Startup Draft: Grammar.</w:t>
       </w:r>
     </w:p>
     <w:p>
@@ -3523,7 +3507,7 @@
         <w:pStyle w:val="ListBullet"/>
       </w:pPr>
       <w:r>
-        <w:t>Startup Draft: Grammar.</w:t>
+        <w:t>Rule Changes: The referenced "section 27" did not exist; Changelog section added.</w:t>
       </w:r>
     </w:p>
     <w:p>
@@ -3531,7 +3515,7 @@
         <w:pStyle w:val="ListBullet"/>
       </w:pPr>
       <w:r>
-        <w:t>Rule Changes: The referenced "section 27" did not exist; Changelog section added.</w:t>
+        <w:t>Tie Breakers: Single tiebreaker order = Sleeper's default for leagues without divisions: overall record, points for, higher points against, coin flip (no head-to-head). Source: support.sleeper.com article 2203518.</w:t>
       </w:r>
     </w:p>
     <w:p>
@@ -3539,7 +3523,7 @@
         <w:pStyle w:val="ListBullet"/>
       </w:pPr>
       <w:r>
-        <w:t>Tie Breakers: Single tiebreaker order = Sleeper's default for leagues without divisions: overall record, points for, higher points against, coin flip (no head-to-head). Source: support.sleeper.com article 2203518.</w:t>
+        <w:t>Regular Season, Playoffs, and Toilet Bowl: Single tiebreaker order = Sleeper's default for leagues without divisions: overall record, points for, higher points against, coin flip (no head-to-head). Source: support.sleeper.com article 2203518.</w:t>
       </w:r>
     </w:p>
     <w:p>
@@ -3547,7 +3531,55 @@
         <w:pStyle w:val="ListBullet"/>
       </w:pPr>
       <w:r>
-        <w:t>Regular Season, Playoffs, and Toilet Bowl: Single tiebreaker order = Sleeper's default for leagues without divisions: overall record, points for, higher points against, coin flip (no head-to-head). Source: support.sleeper.com article 2203518.</w:t>
+        <w:t>League Summary: League dropped its former third-party dues platform. Dues are now simply paid by Venmo to either co-commissioner, who take turns managing the money; formal collection/escrow language removed.</w:t>
+      </w:r>
+    </w:p>
+    <w:p>
+      <w:pPr>
+        <w:pStyle w:val="ListBullet"/>
+      </w:pPr>
+      <w:r>
+        <w:t>League Summary: Duplicate of "League Annual Fee: $100".</w:t>
+      </w:r>
+    </w:p>
+    <w:p>
+      <w:pPr>
+        <w:pStyle w:val="ListBullet"/>
+      </w:pPr>
+      <w:r>
+        <w:t>General League Calendar: League dropped its former third-party dues platform. Dues are now simply paid by Venmo to either co-commissioner, who take turns managing the money; formal collection/escrow language removed.</w:t>
+      </w:r>
+    </w:p>
+    <w:p>
+      <w:pPr>
+        <w:pStyle w:val="ListBullet"/>
+      </w:pPr>
+      <w:r>
+        <w:t>League Platforms: League dropped its former third-party dues platform. Dues are now simply paid by Venmo to either co-commissioner, who take turns managing the money; formal collection/escrow language removed.</w:t>
+      </w:r>
+    </w:p>
+    <w:p>
+      <w:pPr>
+        <w:pStyle w:val="ListBullet"/>
+      </w:pPr>
+      <w:r>
+        <w:t>Fees &amp; Payouts: League dropped its former third-party dues platform. Dues are now simply paid by Venmo to either co-commissioner, who take turns managing the money; formal collection/escrow language removed.</w:t>
+      </w:r>
+    </w:p>
+    <w:p>
+      <w:pPr>
+        <w:pStyle w:val="ListBullet"/>
+      </w:pPr>
+      <w:r>
+        <w:t>Refunds: League dropped its former third-party dues platform. Dues are now simply paid by Venmo to either co-commissioner, who take turns managing the money; formal collection/escrow language removed.</w:t>
+      </w:r>
+    </w:p>
+    <w:p>
+      <w:pPr>
+        <w:pStyle w:val="ListBullet"/>
+      </w:pPr>
+      <w:r>
+        <w:t>League Disbanding: League dropped its former third-party dues platform. Dues are now simply paid by Venmo to either co-commissioner, who take turns managing the money; formal collection/escrow language removed.</w:t>
       </w:r>
     </w:p>
     <w:sectPr>

</xml_diff>

<commit_message>
Bylaws: replacement-owner dues case by case (drop unenforced $60 refund rule); merge duplicate changelog notes; regen docx/pdf; office.js v8
</commit_message>
<xml_diff>
--- a/office/docs/bylaws-2026.docx
+++ b/office/docs/bylaws-2026.docx
@@ -2603,15 +2603,7 @@
         <w:pStyle w:val="ListBullet"/>
       </w:pPr>
       <w:r>
-        <w:t>If the leaving owner provides an acceptable replacement owner who is willing to pay any portion of league fees, then the leaving owner can receive a refund of league fees for the matching amount.</w:t>
-      </w:r>
-    </w:p>
-    <w:p>
-      <w:pPr>
-        <w:pStyle w:val="ListBullet2"/>
-      </w:pPr>
-      <w:r>
-        <w:t>Example: Leaving Owner finds Replacement Owner. Replacement owner Venmos $60 to the co-commissioner holding the money (partial current year, full prepaid year). Leaving owner receives a refund of up to $60.</w:t>
+        <w:t>Replacement owner dues are decided case by case by the co-commissioners, depending on the state of the team inherited.</w:t>
       </w:r>
     </w:p>
     <w:p>
@@ -3315,7 +3307,7 @@
           <w:b/>
           <w:color w:val="1A2A4A"/>
         </w:rPr>
-        <w:t>October 2026: bylaws aligned to the live Sleeper settings (all differences previously approved by the league) and typos/formatting fixed. Changes:</w:t>
+        <w:t>October 2026: bylaws aligned to the live Sleeper settings (all differences previously approved by the league), league-approved updates applied, and typos/formatting fixed. Changes:</w:t>
       </w:r>
     </w:p>
     <w:p>
@@ -3371,7 +3363,7 @@
         <w:pStyle w:val="ListBullet"/>
       </w:pPr>
       <w:r>
-        <w:t>Scoring: Grammar.</w:t>
+        <w:t>Scoring, Teams, Ownership, and Replacement, Startup Draft: Grammar.</w:t>
       </w:r>
     </w:p>
     <w:p>
@@ -3483,7 +3475,7 @@
         <w:pStyle w:val="ListBullet"/>
       </w:pPr>
       <w:r>
-        <w:t>Teams, Ownership, and Replacement: Grammar.</w:t>
+        <w:t>Refunds: Garbled phrase.</w:t>
       </w:r>
     </w:p>
     <w:p>
@@ -3491,7 +3483,7 @@
         <w:pStyle w:val="ListBullet"/>
       </w:pPr>
       <w:r>
-        <w:t>Refunds: Garbled phrase.</w:t>
+        <w:t>Rule Changes: The referenced "section 27" did not exist; Changelog section added.</w:t>
       </w:r>
     </w:p>
     <w:p>
@@ -3499,7 +3491,7 @@
         <w:pStyle w:val="ListBullet"/>
       </w:pPr>
       <w:r>
-        <w:t>Startup Draft: Grammar.</w:t>
+        <w:t>Tie Breakers, Regular Season, Playoffs, and Toilet Bowl: Single tiebreaker order = Sleeper's default for leagues without divisions: overall record, points for, higher points against, coin flip (no head-to-head). Source: support.sleeper.com article 2203518.</w:t>
       </w:r>
     </w:p>
     <w:p>
@@ -3507,7 +3499,7 @@
         <w:pStyle w:val="ListBullet"/>
       </w:pPr>
       <w:r>
-        <w:t>Rule Changes: The referenced "section 27" did not exist; Changelog section added.</w:t>
+        <w:t>League Summary, General League Calendar, League Platforms, Fees &amp; Payouts, Refunds, League Disbanding: League dropped its former third-party dues platform. Dues are now simply paid by Venmo to either co-commissioner, who take turns managing the money; formal collection/escrow language removed.</w:t>
       </w:r>
     </w:p>
     <w:p>
@@ -3515,7 +3507,7 @@
         <w:pStyle w:val="ListBullet"/>
       </w:pPr>
       <w:r>
-        <w:t>Tie Breakers: Single tiebreaker order = Sleeper's default for leagues without divisions: overall record, points for, higher points against, coin flip (no head-to-head). Source: support.sleeper.com article 2203518.</w:t>
+        <w:t>League Summary: Duplicate of "League Annual Fee: $100".</w:t>
       </w:r>
     </w:p>
     <w:p>
@@ -3523,63 +3515,7 @@
         <w:pStyle w:val="ListBullet"/>
       </w:pPr>
       <w:r>
-        <w:t>Regular Season, Playoffs, and Toilet Bowl: Single tiebreaker order = Sleeper's default for leagues without divisions: overall record, points for, higher points against, coin flip (no head-to-head). Source: support.sleeper.com article 2203518.</w:t>
-      </w:r>
-    </w:p>
-    <w:p>
-      <w:pPr>
-        <w:pStyle w:val="ListBullet"/>
-      </w:pPr>
-      <w:r>
-        <w:t>League Summary: League dropped its former third-party dues platform. Dues are now simply paid by Venmo to either co-commissioner, who take turns managing the money; formal collection/escrow language removed.</w:t>
-      </w:r>
-    </w:p>
-    <w:p>
-      <w:pPr>
-        <w:pStyle w:val="ListBullet"/>
-      </w:pPr>
-      <w:r>
-        <w:t>League Summary: Duplicate of "League Annual Fee: $100".</w:t>
-      </w:r>
-    </w:p>
-    <w:p>
-      <w:pPr>
-        <w:pStyle w:val="ListBullet"/>
-      </w:pPr>
-      <w:r>
-        <w:t>General League Calendar: League dropped its former third-party dues platform. Dues are now simply paid by Venmo to either co-commissioner, who take turns managing the money; formal collection/escrow language removed.</w:t>
-      </w:r>
-    </w:p>
-    <w:p>
-      <w:pPr>
-        <w:pStyle w:val="ListBullet"/>
-      </w:pPr>
-      <w:r>
-        <w:t>League Platforms: League dropped its former third-party dues platform. Dues are now simply paid by Venmo to either co-commissioner, who take turns managing the money; formal collection/escrow language removed.</w:t>
-      </w:r>
-    </w:p>
-    <w:p>
-      <w:pPr>
-        <w:pStyle w:val="ListBullet"/>
-      </w:pPr>
-      <w:r>
-        <w:t>Fees &amp; Payouts: League dropped its former third-party dues platform. Dues are now simply paid by Venmo to either co-commissioner, who take turns managing the money; formal collection/escrow language removed.</w:t>
-      </w:r>
-    </w:p>
-    <w:p>
-      <w:pPr>
-        <w:pStyle w:val="ListBullet"/>
-      </w:pPr>
-      <w:r>
-        <w:t>Refunds: League dropped its former third-party dues platform. Dues are now simply paid by Venmo to either co-commissioner, who take turns managing the money; formal collection/escrow language removed.</w:t>
-      </w:r>
-    </w:p>
-    <w:p>
-      <w:pPr>
-        <w:pStyle w:val="ListBullet"/>
-      </w:pPr>
-      <w:r>
-        <w:t>League Disbanding: League dropped its former third-party dues platform. Dues are now simply paid by Venmo to either co-commissioner, who take turns managing the money; formal collection/escrow language removed.</w:t>
+        <w:t>Refunds: The $60 replacement-owner refund rule was never enforced (in practice the co-commissioners have handled replacement dues case by case); replaced with the actual practice.</w:t>
       </w:r>
     </w:p>
     <w:sectPr>

</xml_diff>